<commit_message>
Add start.bat / stop.bat and update hosting doc
- start.bat: opens labeled CMD windows for backend and frontend, waits
  for backend to initialise, then opens browser at localhost:5173;
  checks port 8000 is free before starting
- stop.bat: kills services by port (8000/5173) using netstat + taskkill
  by PID -- does not affect unrelated python.exe or node.exe processes
- Hosting doc: add Step 9 (Daily Start/Stop scripts) to Section 4;
  update Section 14.6 to reference stop.bat/start.bat; fix stale
  physics_assessor.db references in Sections 5.4 and 5.5

Co-Authored-By: Claude Sonnet 4.6 <noreply@anthropic.com>
</commit_message>
<xml_diff>
--- a/Documents/Technical Documents/Science_Assessor_Hosting_v1_0.docx
+++ b/Documents/Technical Documents/Science_Assessor_Hosting_v1_0.docx
@@ -1498,6 +1498,110 @@
       </w:r>
     </w:p>
     <w:p>
+      <w:pPr>
+        <w:pStyle w:val="Heading2"/>
+      </w:pPr>
+      <w:r>
+        <w:t>Step 9 — Daily Start / Stop (convenience scripts)</w:t>
+      </w:r>
+    </w:p>
+    <w:p>
+      <w:pPr/>
+      <w:r>
+        <w:t>The project root contains two convenience scripts for daily use instead of opening separate terminals:</w:t>
+      </w:r>
+    </w:p>
+    <w:p>
+      <w:pPr/>
+      <w:r/>
+    </w:p>
+    <w:p>
+      <w:pPr>
+        <w:pStyle w:val="Heading3"/>
+      </w:pPr>
+      <w:r>
+        <w:t>start.bat  —  Start the application</w:t>
+      </w:r>
+    </w:p>
+    <w:p>
+      <w:pPr/>
+      <w:r>
+        <w:t>Double-click start.bat in the project root (or run it from a Command Prompt). It will:</w:t>
+      </w:r>
+    </w:p>
+    <w:p>
+      <w:pPr>
+        <w:pStyle w:val="ListBullet"/>
+      </w:pPr>
+      <w:r>
+        <w:t>Check that port 8000 is free (exits with a warning if the port is already in use)</w:t>
+      </w:r>
+    </w:p>
+    <w:p>
+      <w:pPr>
+        <w:pStyle w:val="ListBullet"/>
+      </w:pPr>
+      <w:r>
+        <w:t>Open a labeled CMD window for the backend (activates .venv, starts uvicorn --reload)</w:t>
+      </w:r>
+    </w:p>
+    <w:p>
+      <w:pPr>
+        <w:pStyle w:val="ListBullet"/>
+      </w:pPr>
+      <w:r>
+        <w:t>Wait 4 seconds for the backend to initialise</w:t>
+      </w:r>
+    </w:p>
+    <w:p>
+      <w:pPr>
+        <w:pStyle w:val="ListBullet"/>
+      </w:pPr>
+      <w:r>
+        <w:t>Open a labeled CMD window for the frontend (npm run dev)</w:t>
+      </w:r>
+    </w:p>
+    <w:p>
+      <w:pPr>
+        <w:pStyle w:val="ListBullet"/>
+      </w:pPr>
+      <w:r>
+        <w:t>Open http://localhost:5173 in the default browser after 3 seconds</w:t>
+      </w:r>
+    </w:p>
+    <w:p>
+      <w:pPr/>
+      <w:r>
+        <w:t>C:\CBSE10\science\start.bat</w:t>
+      </w:r>
+    </w:p>
+    <w:p>
+      <w:pPr>
+        <w:pStyle w:val="Heading3"/>
+      </w:pPr>
+      <w:r>
+        <w:t>stop.bat  —  Stop the application</w:t>
+      </w:r>
+    </w:p>
+    <w:p>
+      <w:pPr/>
+      <w:r>
+        <w:t>Run stop.bat from the project root to kill both services by port number. It will NOT kill unrelated node.exe or python.exe processes on the machine.</w:t>
+      </w:r>
+    </w:p>
+    <w:p>
+      <w:pPr/>
+      <w:r>
+        <w:t>C:\CBSE10\science\stop.bat</w:t>
+      </w:r>
+    </w:p>
+    <w:p>
+      <w:pPr/>
+      <w:r>
+        <w:t>Note: The CMD windows opened by start.bat may remain open after stop.bat runs. Close them manually.</w:t>
+      </w:r>
+    </w:p>
+    <w:p>
       <w:r>
         <w:br w:type="page"/>
       </w:r>
@@ -1666,7 +1770,7 @@
           </w:tcPr>
           <w:p>
             <w:r>
-              <w:t>Delete physics_assessor.db manually</w:t>
+              <w:t>Delete science_assessor.db manually</w:t>
             </w:r>
           </w:p>
         </w:tc>
@@ -1862,14 +1966,9 @@
         <w:ind w:left="454"/>
       </w:pPr>
       <w:r>
-        <w:rPr>
-          <w:rFonts w:ascii="Courier New" w:hAnsi="Courier New"/>
-          <w:color w:val="1A1A2E"/>
-          <w:sz w:val="18"/>
-        </w:rPr>
         <w:t># These two items contain all user data -- back them up regularly:</w:t>
         <w:br/>
-        <w:t>C:\CBSE10\science\data\physics_assessor.db    &lt;- all sessions, scores, streaks, profile</w:t>
+        <w:t>C:\CBSE10\science\data\science_assessor.db    &lt;- all sessions, scores, streaks, profile</w:t>
         <w:br/>
         <w:t>C:\CBSE10\science\data\uploads\               &lt;- submitted answer PDFs</w:t>
       </w:r>
@@ -1884,12 +1983,7 @@
         <w:ind w:left="454"/>
       </w:pPr>
       <w:r>
-        <w:rPr>
-          <w:rFonts w:ascii="Courier New" w:hAnsi="Courier New"/>
-          <w:color w:val="1A1A2E"/>
-          <w:sz w:val="18"/>
-        </w:rPr>
-        <w:t>copy "C:\CBSE10\science\data\physics_assessor.db" "C:\CBSE10\science\data\physics_assessor_backup.db"</w:t>
+        <w:t>copy "C:\CBSE10\science\data\science_assessor.db" "C:\CBSE10\science\data\science_assessor_backup.db"</w:t>
       </w:r>
     </w:p>
     <w:p/>
@@ -1914,16 +2008,11 @@
         <w:ind w:left="454"/>
       </w:pPr>
       <w:r>
-        <w:rPr>
-          <w:rFonts w:ascii="Courier New" w:hAnsi="Courier New"/>
-          <w:color w:val="1A1A2E"/>
-          <w:sz w:val="18"/>
-        </w:rPr>
         <w:t># 1. Stop the backend</w:t>
         <w:br/>
         <w:t># 2. Delete the database</w:t>
         <w:br/>
-        <w:t>del C:\CBSE10\science\data\physics_assessor.db</w:t>
+        <w:t>del C:\CBSE10\science\data\science_assessor.db</w:t>
         <w:br/>
         <w:br/>
         <w:t># 3. Restart backend -- init_db() recreates all tables automatically</w:t>
@@ -1966,11 +2055,6 @@
         <w:ind w:left="454"/>
       </w:pPr>
       <w:r>
-        <w:rPr>
-          <w:rFonts w:ascii="Courier New" w:hAnsi="Courier New"/>
-          <w:color w:val="1A1A2E"/>
-          <w:sz w:val="18"/>
-        </w:rPr>
         <w:t>C:\CBSE10\science\</w:t>
         <w:br/>
         <w:t>|</w:t>
@@ -2051,7 +2135,7 @@
         <w:br/>
         <w:t>+-- data\</w:t>
         <w:br/>
-        <w:t xml:space="preserve">    +-- physics_assessor.db       &lt;- SQLite database (all runtime data)</w:t>
+        <w:t xml:space="preserve">    +-- science_assessor.db       &lt;- SQLite database (all runtime data)</w:t>
         <w:br/>
         <w:t xml:space="preserve">    +-- config\</w:t>
         <w:br/>
@@ -2922,7 +3006,7 @@
           </w:tcPr>
           <w:p>
             <w:r>
-              <w:t>../data/physics_assessor.db</w:t>
+              <w:t>../data/science_assessor.db</w:t>
             </w:r>
           </w:p>
         </w:tc>
@@ -6690,23 +6774,25 @@
         <w:ind w:left="454"/>
       </w:pPr>
       <w:r>
-        <w:rPr>
-          <w:rFonts w:ascii="Courier New" w:hAnsi="Courier New"/>
-          <w:color w:val="1A1A2E"/>
-          <w:sz w:val="18"/>
-        </w:rPr>
-        <w:t># Stop existing uvicorn process (Ctrl+C or kill the process)</w:t>
-        <w:br/>
-        <w:t># Then restart:</w:t>
-        <w:br/>
-        <w:t>cd C:\CBSE10\science</w:t>
-        <w:br/>
-        <w:t>uvicorn backend.main:app --reload --app-dir .</w:t>
-        <w:br/>
-        <w:br/>
-        <w:t># Frontend dev server -- restart if package.json changed:</w:t>
-        <w:br/>
-        <w:t>cd frontend &amp;&amp; npm run dev</w:t>
+        <w:t>Using the convenience scripts (recommended):</w:t>
+      </w:r>
+    </w:p>
+    <w:p>
+      <w:pPr/>
+      <w:r>
+        <w:t>stop.bat    &lt;- stops both services (kills PIDs on ports 8000 and 5173)</w:t>
+      </w:r>
+    </w:p>
+    <w:p>
+      <w:pPr/>
+      <w:r>
+        <w:t>start.bat   &lt;- starts both services and opens browser</w:t>
+      </w:r>
+    </w:p>
+    <w:p>
+      <w:pPr/>
+      <w:r>
+        <w:t>Or manually (Ctrl+C in each window, then re-run commands from Step 6 and Step 7).</w:t>
       </w:r>
     </w:p>
     <w:p>

</xml_diff>

<commit_message>
Update hosting doc: index_questions safe to re-run; add v4.1 upgrade note
- Step 5: replace import_questions with index_questions throughout
- Section 14.5: clarify index_questions is safe to re-run (INSERT OR REPLACE)
- Add upgrade note: existing installs must re-run index_questions once to
  populate topic and use_for columns added in this version

Co-Authored-By: Claude Sonnet 4.6 <noreply@anthropic.com>
</commit_message>
<xml_diff>
--- a/Documents/Technical Documents/Science_Assessor_Hosting_v1_0.docx
+++ b/Documents/Technical Documents/Science_Assessor_Hosting_v1_0.docx
@@ -1377,14 +1377,9 @@
         <w:ind w:left="454"/>
       </w:pPr>
       <w:r>
-        <w:rPr>
-          <w:rFonts w:ascii="Courier New" w:hAnsi="Courier New"/>
-          <w:color w:val="1A1A2E"/>
-          <w:sz w:val="18"/>
-        </w:rPr>
         <w:t>cd C:\CBSE10\science</w:t>
         <w:br/>
-        <w:t>python -m backend.scripts.import_questions</w:t>
+        <w:t>python -m backend.scripts.index_questions</w:t>
       </w:r>
     </w:p>
     <w:p>
@@ -1394,11 +1389,7 @@
     </w:p>
     <w:p>
       <w:r>
-        <w:rPr>
-          <w:b/>
-          <w:color w:val="CC0000"/>
-        </w:rPr>
-        <w:t>WARNING: Run import_questions ONLY on a fresh database. Do NOT re-run it against a database that already has session history -- it will re-import question_index and may create duplicates.</w:t>
+        <w:t>Run index_questions once after a fresh clone. It is safe to re-run on existing databases -- it uses INSERT OR REPLACE and never deletes data. Re-run it after any update that adds new questions or topic tags.</w:t>
       </w:r>
     </w:p>
     <w:p>
@@ -1924,7 +1915,7 @@
         <w:pStyle w:val="ListBullet"/>
       </w:pPr>
       <w:r>
-        <w:t>2. Update the corresponding rows in question_index (run import_questions.py on a fresh DB, or UPDATE manually)</w:t>
+        <w:t>2. Update the corresponding rows in question_index (run index_questions.py to re-index, or UPDATE manually)</w:t>
       </w:r>
     </w:p>
     <w:p>
@@ -2022,7 +2013,7 @@
         <w:br/>
         <w:t># 4. Re-import questions (required after DB deletion)</w:t>
         <w:br/>
-        <w:t>python -m backend.scripts.import_questions</w:t>
+        <w:t>python -m backend.scripts.index_questions</w:t>
       </w:r>
     </w:p>
     <w:p>
@@ -6738,19 +6729,18 @@
         <w:pStyle w:val="Heading2"/>
       </w:pPr>
       <w:r>
-        <w:rPr>
-          <w:color w:val="2E74B5"/>
-        </w:rPr>
-        <w:t>14.5  Do NOT Re-run import_questions.py on Update</w:t>
+        <w:t>14.5  Re-run index_questions.py on Update (if questions or topics changed)</w:t>
       </w:r>
     </w:p>
     <w:p>
       <w:r>
-        <w:rPr>
-          <w:b/>
-          <w:color w:val="CC0000"/>
-        </w:rPr>
-        <w:t>WARNING: import_questions.py is a one-time initial setup script. Running it again on an existing database will re-import the question_index and may create duplicate rows. Only run it on a fresh empty database.</w:t>
+        <w:t>index_questions.py is safe to re-run on any existing database. Use INSERT OR REPLACE -- it never removes data. Re-run it whenever: (a) new question JSON files are added, (b) topic or use_for fields are updated in the JSON files, or (c) the question bank is refreshed from a new version of the repo.</w:t>
+      </w:r>
+    </w:p>
+    <w:p>
+      <w:pPr/>
+      <w:r>
+        <w:t>Note for upgrades from v4.0: the topic and use_for columns were added in v4.1. After pulling the latest code, re-run index_questions.py once to populate these fields in your existing database.</w:t>
       </w:r>
     </w:p>
     <w:p>

</xml_diff>